<commit_message>
updeated the Contact and project
</commit_message>
<xml_diff>
--- a/Aman_Karn(24CS015).docx
+++ b/Aman_Karn(24CS015).docx
@@ -92,7 +92,14 @@
           <w:rFonts w:ascii="Times New Roman"/>
           <w:sz w:val="23"/>
         </w:rPr>
-        <w:t>+91 9345806517</w:t>
+        <w:t>+91</w:t>
+      </w:r>
+      <w:r>
+        <w:rPr>
+          <w:rFonts w:ascii="Times New Roman"/>
+          <w:sz w:val="23"/>
+        </w:rPr>
+        <w:t xml:space="preserve"> 7204840692</w:t>
       </w:r>
       <w:r>
         <w:rPr>
@@ -325,7 +332,7 @@
           </mc:Choice>
           <mc:Fallback>
             <w:pict>
-              <v:group w14:anchorId="3F58275A" id="Group 2" o:spid="_x0000_s1026" style="width:2.9pt;height:.6pt;mso-position-horizontal-relative:char;mso-position-vertical-relative:line" coordsize="36830,7620" o:gfxdata="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">
+              <v:group w14:anchorId="21396098" id="Group 2" o:spid="_x0000_s1026" style="width:2.9pt;height:.6pt;mso-position-horizontal-relative:char;mso-position-vertical-relative:line" coordsize="36830,7620" o:gfxdata="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">
                 <v:shape id="Graphic 3" o:spid="_x0000_s1027" style="position:absolute;width:36830;height:7620;visibility:visible;mso-wrap-style:square;v-text-anchor:top" coordsize="36830,7620" o:gfxdata="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" path="m36574,l,,,7620r36574,l36574,xe" fillcolor="black" stroked="f">
                   <v:path arrowok="t"/>
                 </v:shape>
@@ -894,7 +901,7 @@
           </mc:Choice>
           <mc:Fallback>
             <w:pict>
-              <v:shape w14:anchorId="72798AF2" id="Graphic 4" o:spid="_x0000_s1026" style="position:absolute;margin-left:21.55pt;margin-top:14.05pt;width:549.9pt;height:.1pt;z-index:15729664;visibility:visible;mso-wrap-style:square;mso-wrap-distance-left:0;mso-wrap-distance-top:0;mso-wrap-distance-right:0;mso-wrap-distance-bottom:0;mso-position-horizontal:absolute;mso-position-horizontal-relative:page;mso-position-vertical:absolute;mso-position-vertical-relative:text;v-text-anchor:top" coordsize="6983730,1270" o:gfxdata="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" path="m,l6983730,e" filled="f" strokeweight="2.25pt">
+              <v:shape w14:anchorId="1FB40E83" id="Graphic 4" o:spid="_x0000_s1026" style="position:absolute;margin-left:21.55pt;margin-top:14.05pt;width:549.9pt;height:.1pt;z-index:15729664;visibility:visible;mso-wrap-style:square;mso-wrap-distance-left:0;mso-wrap-distance-top:0;mso-wrap-distance-right:0;mso-wrap-distance-bottom:0;mso-position-horizontal:absolute;mso-position-horizontal-relative:page;mso-position-vertical:absolute;mso-position-vertical-relative:text;v-text-anchor:top" coordsize="6983730,1270" o:gfxdata="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" path="m,l6983730,e" filled="f" strokeweight="2.25pt">
                 <v:path arrowok="t"/>
                 <w10:wrap anchorx="page"/>
               </v:shape>
@@ -1058,15 +1065,7 @@
         <w:jc w:val="both"/>
       </w:pPr>
       <w:r>
-        <w:t xml:space="preserve">Developed a full-stack web application for efficient hostel complaint management, enabling students to submit issues, wardens to assign tasks, and workers to update progress in real time. The system ensures transparency and faster resolution through role-based access control, real-time updates, and </w:t>
-      </w:r>
-      <w:proofErr w:type="gramStart"/>
-      <w:r>
-        <w:t>a secure</w:t>
-      </w:r>
-      <w:proofErr w:type="gramEnd"/>
-      <w:r>
-        <w:t>, scalable architecture.</w:t>
+        <w:t>Developed a full-stack web application for efficient hostel complaint management, enabling students to submit issues, wardens to assign tasks, and workers to update progress in real time. The system ensures transparency and faster resolution through role-based access control, real-time updates, and a secure, scalable architecture.</w:t>
       </w:r>
     </w:p>
     <w:p>
@@ -1239,14 +1238,12 @@
         </w:rPr>
         <w:t xml:space="preserve"> </w:t>
       </w:r>
-      <w:proofErr w:type="spellStart"/>
       <w:r>
         <w:rPr>
           <w:b/>
         </w:rPr>
         <w:t>MiDaS</w:t>
       </w:r>
-      <w:proofErr w:type="spellEnd"/>
       <w:r>
         <w:rPr>
           <w:b/>
@@ -1847,14 +1844,12 @@
                 <w:b/>
               </w:rPr>
             </w:pPr>
-            <w:proofErr w:type="spellStart"/>
             <w:r>
               <w:rPr>
                 <w:b/>
               </w:rPr>
               <w:t>SimpleLearn</w:t>
             </w:r>
-            <w:proofErr w:type="spellEnd"/>
           </w:p>
         </w:tc>
         <w:tc>
@@ -1913,14 +1908,12 @@
                 <w:b/>
               </w:rPr>
             </w:pPr>
-            <w:proofErr w:type="spellStart"/>
             <w:r>
               <w:rPr>
                 <w:b/>
               </w:rPr>
               <w:t>HakkerRank</w:t>
             </w:r>
-            <w:proofErr w:type="spellEnd"/>
           </w:p>
         </w:tc>
         <w:tc>
@@ -1996,11 +1989,9 @@
                 <w:b/>
               </w:rPr>
             </w:pPr>
-            <w:proofErr w:type="spellStart"/>
             <w:r>
               <w:t>CoddyTech</w:t>
             </w:r>
-            <w:proofErr w:type="spellEnd"/>
           </w:p>
         </w:tc>
         <w:tc>
@@ -2239,14 +2230,12 @@
                 <w:color w:val="0D0D0D" w:themeColor="text1" w:themeTint="F2"/>
               </w:rPr>
             </w:pPr>
-            <w:proofErr w:type="spellStart"/>
             <w:r>
               <w:rPr>
                 <w:b/>
               </w:rPr>
               <w:t>LeetCode</w:t>
             </w:r>
-            <w:proofErr w:type="spellEnd"/>
             <w:r>
               <w:rPr>
                 <w:b/>
@@ -2338,19 +2327,11 @@
             <w:r>
               <w:t xml:space="preserve"> </w:t>
             </w:r>
-            <w:proofErr w:type="spellStart"/>
-            <w:r>
-              <w:rPr>
-                <w:b/>
-              </w:rPr>
-              <w:t>Skillrack</w:t>
-            </w:r>
-            <w:proofErr w:type="spellEnd"/>
-            <w:r>
-              <w:rPr>
-                <w:b/>
-              </w:rPr>
-              <w:t xml:space="preserve"> </w:t>
+            <w:r>
+              <w:rPr>
+                <w:b/>
+              </w:rPr>
+              <w:t xml:space="preserve">Skillrack </w:t>
             </w:r>
             <w:r>
               <w:t xml:space="preserve">Solved 1200+ problems | </w:t>
@@ -2370,19 +2351,11 @@
               <w:spacing w:before="12"/>
               <w:ind w:left="2" w:right="3284"/>
             </w:pPr>
-            <w:proofErr w:type="spellStart"/>
-            <w:r>
-              <w:rPr>
-                <w:b/>
-              </w:rPr>
-              <w:t>HackerRank</w:t>
-            </w:r>
-            <w:proofErr w:type="spellEnd"/>
-            <w:r>
-              <w:rPr>
-                <w:b/>
-              </w:rPr>
-              <w:t xml:space="preserve"> </w:t>
+            <w:r>
+              <w:rPr>
+                <w:b/>
+              </w:rPr>
+              <w:t xml:space="preserve">HackerRank </w:t>
             </w:r>
             <w:r>
               <w:t xml:space="preserve">3 Star C, 3 Star Python, 2 Star Java| </w:t>
@@ -2545,21 +2518,12 @@
                 <w:sz w:val="24"/>
               </w:rPr>
             </w:pPr>
-            <w:proofErr w:type="spellStart"/>
             <w:r>
               <w:rPr>
                 <w:b/>
                 <w:sz w:val="24"/>
               </w:rPr>
-              <w:t>Creatahon</w:t>
-            </w:r>
-            <w:proofErr w:type="spellEnd"/>
-            <w:r>
-              <w:rPr>
-                <w:b/>
-                <w:sz w:val="24"/>
-              </w:rPr>
-              <w:t xml:space="preserve"> </w:t>
+              <w:t xml:space="preserve">Creatahon </w:t>
             </w:r>
             <w:r>
               <w:rPr>
@@ -2612,21 +2576,12 @@
                 <w:sz w:val="24"/>
               </w:rPr>
             </w:pPr>
-            <w:proofErr w:type="spellStart"/>
             <w:r>
               <w:rPr>
                 <w:b/>
                 <w:sz w:val="24"/>
               </w:rPr>
-              <w:t>Freshathon</w:t>
-            </w:r>
-            <w:proofErr w:type="spellEnd"/>
-            <w:r>
-              <w:rPr>
-                <w:b/>
-                <w:sz w:val="24"/>
-              </w:rPr>
-              <w:t xml:space="preserve"> </w:t>
+              <w:t xml:space="preserve">Freshathon </w:t>
             </w:r>
             <w:r>
               <w:rPr>
@@ -2975,11 +2930,9 @@
               </w:rPr>
               <w:t xml:space="preserve"> </w:t>
             </w:r>
-            <w:proofErr w:type="spellStart"/>
             <w:r>
               <w:t>Pytorch</w:t>
             </w:r>
-            <w:proofErr w:type="spellEnd"/>
             <w:r>
               <w:rPr>
                 <w:spacing w:val="-5"/>
@@ -3048,11 +3001,9 @@
               </w:rPr>
               <w:t xml:space="preserve"> </w:t>
             </w:r>
-            <w:proofErr w:type="spellStart"/>
             <w:r>
               <w:t>VSCode</w:t>
             </w:r>
-            <w:proofErr w:type="spellEnd"/>
             <w:r>
               <w:rPr>
                 <w:spacing w:val="-6"/>
@@ -3122,11 +3073,9 @@
               </w:rPr>
               <w:t xml:space="preserve"> </w:t>
             </w:r>
-            <w:proofErr w:type="spellStart"/>
             <w:r>
               <w:t>Jupyter</w:t>
             </w:r>
-            <w:proofErr w:type="spellEnd"/>
             <w:r>
               <w:rPr>
                 <w:spacing w:val="-4"/>
@@ -3214,42 +3163,27 @@
                 <w:b/>
                 <w:bCs/>
               </w:rPr>
-              <w:t xml:space="preserve">Office &amp; Productivity </w:t>
-            </w:r>
-            <w:proofErr w:type="gramStart"/>
+              <w:t>Office &amp; Productivity Tools</w:t>
+            </w:r>
             <w:r>
               <w:rPr>
                 <w:b/>
                 <w:bCs/>
               </w:rPr>
-              <w:t>Tools</w:t>
+              <w:t xml:space="preserve"> </w:t>
             </w:r>
             <w:r>
               <w:rPr>
                 <w:b/>
                 <w:bCs/>
               </w:rPr>
-              <w:t xml:space="preserve"> </w:t>
-            </w:r>
-            <w:r>
-              <w:rPr>
-                <w:b/>
-                <w:bCs/>
-              </w:rPr>
               <w:t>:</w:t>
             </w:r>
             <w:r>
               <w:rPr>
                 <w:b/>
               </w:rPr>
-              <w:t>Microsoft</w:t>
-            </w:r>
-            <w:proofErr w:type="gramEnd"/>
-            <w:r>
-              <w:rPr>
-                <w:b/>
-              </w:rPr>
-              <w:t xml:space="preserve"> Word | Microsoft Excel | Microsoft PowerPoint </w:t>
+              <w:t xml:space="preserve">Microsoft Word | Microsoft Excel | Microsoft PowerPoint </w:t>
             </w:r>
           </w:p>
         </w:tc>

</xml_diff>